<commit_message>
Rewrite Book Three and its practical guide in the reference style
Co-Authored-By: Claude Opus 5.5 <noreply@anthropic.com>
Claude-Session: https://claude.ai/code/session_01LhGpaEd3xGUonrLS6HmYox
</commit_message>
<xml_diff>
--- a/book/الدليل_العملي_المرافق_للكتاب_الثالث.docx
+++ b/book/الدليل_العملي_المرافق_للكتاب_الثالث.docx
@@ -94,7 +94,7 @@
           <w:sz w:val="28"/>
           <w:szCs w:val="28"/>
         </w:rPr>
-        <w:t xml:space="preserve">في هذا الدليل مخرجات التعلم التي فُصلت عن الكتاب الثالث حين اختُصر، جدول لكل فصل. يُقرأ مع الكتاب ولا يغني عنه. لكل مخرج رمز يدل على فصله، ومستوى من تصنيف بلوم المعدّل: L1 معرفة، وL2 فهم، وL3 تطبيق، وL4 تحليل، وL5 تقويم، وL6 تركيب. والأرقام بين القوسين أقسام الكتاب التي يقوم عليها المخرج.</w:t>
+        <w:t xml:space="preserve">ما الذي ينبغي أن يقدر عليه القارئ حين يفرغ من كل فصل من فصول الكتاب الثالث؟ إنّ الجواب في مخرجات التعلم التي فُصلت عن الكتاب حين اختُصر، وقد جُمعت في هذا الدليل جدولًا لكل فصل، ولكل مخرج رمز يدل على فصله، ومستوى من تصنيف بلوم المعدّل، وهي: L1 معرفة، وL2 فهم، وL3 تطبيق، وL4 تحليل، وL5 تقويم، وL6 تركيب؛ أما الأرقام بين القوسين فهي أقسام الكتاب التي يقوم عليها المخرج. يُقرأ الدليل مع الكتاب، ولا يغني عنه.</w:t>
       </w:r>
     </w:p>
     <w:p>
@@ -668,7 +668,7 @@
                 <w:sz w:val="24"/>
                 <w:szCs w:val="24"/>
               </w:rPr>
-              <w:t xml:space="preserve">يحمل آية واحدة على سلم الاشتقاق القطاعي حتى مستوى بناء الأداة (1.8)</w:t>
+              <w:t xml:space="preserve">يحمل آية واحدة على سلم الاشتقاق القطاعي، صاعدًا بها حتى مستوى بناء الأداة (1.8)</w:t>
             </w:r>
           </w:p>
         </w:tc>
@@ -1276,7 +1276,7 @@
                 <w:sz w:val="24"/>
                 <w:szCs w:val="24"/>
               </w:rPr>
-              <w:t xml:space="preserve">يوازن بين QSRM وأدوات الجودة الدولية، ويبيّن الفروق الجوهرية</w:t>
+              <w:t xml:space="preserve">يوازن بين QSRM وأدوات الجودة الدولية، ويبيّن ما بينها من فروق جوهرية</w:t>
             </w:r>
           </w:p>
         </w:tc>
@@ -2866,7 +2866,7 @@
                 <w:sz w:val="24"/>
                 <w:szCs w:val="24"/>
               </w:rPr>
-              <w:t xml:space="preserve">يميّز المعلّم موظفًا من المعلّم مستخلَفًا، ويحدد أثر كلٍّ منهما في الطالب والمنهج (4.3)</w:t>
+              <w:t xml:space="preserve">يميّز بين المعلّم الموظف والمعلّم المستخلَف، ويحدد أثر كلٍّ منهما في الطالب والمنهج (4.3)</w:t>
             </w:r>
           </w:p>
         </w:tc>
@@ -2991,7 +2991,7 @@
                 <w:sz w:val="24"/>
                 <w:szCs w:val="24"/>
               </w:rPr>
-              <w:t xml:space="preserve">يصمم برنامجًا مبسّطًا لتطوير معلّم ببروتوكول المراحل الخمس (4.4)</w:t>
+              <w:t xml:space="preserve">يصمم برنامجًا مبسّطًا لتطوير معلّم وفق بروتوكول المراحل الخمس (4.4)</w:t>
             </w:r>
           </w:p>
         </w:tc>
@@ -4922,7 +4922,7 @@
                 <w:sz w:val="24"/>
                 <w:szCs w:val="24"/>
               </w:rPr>
-              <w:t xml:space="preserve">يستخلص دروس الرعاية الصحية في التاريخ الإسلامي ويقوّمها (6.5)</w:t>
+              <w:t xml:space="preserve">يستخلص دروس الرعاية الصحية في التاريخ الإسلامي، ويقوّمها (6.5)</w:t>
             </w:r>
           </w:p>
         </w:tc>
@@ -6608,7 +6608,7 @@
                 <w:sz w:val="24"/>
                 <w:szCs w:val="24"/>
               </w:rPr>
-              <w:t xml:space="preserve">يوظّف أركان QMF الثلاثة في القياس الصحي لتصميم منظومة لقياس الأثر (8.2)</w:t>
+              <w:t xml:space="preserve">يوظّف أركان QMF الثلاثة للقياس الصحي في تصميم منظومة تقيس الأثر (8.2)</w:t>
             </w:r>
           </w:p>
         </w:tc>
@@ -7404,7 +7404,7 @@
                 <w:sz w:val="24"/>
                 <w:szCs w:val="24"/>
               </w:rPr>
-              <w:t xml:space="preserve">يستخرج مفاهيم الحقل الاشتقاقي لجذر «ص ن ع»، وينزلها على السياقات الصناعية المعاصرة (9.1)</w:t>
+              <w:t xml:space="preserve">يستخرج مفاهيم الحقل الاشتقاقي لجذر «ص ن ع»، وينزّلها على السياقات الصناعية المعاصرة (9.1)</w:t>
             </w:r>
           </w:p>
         </w:tc>
@@ -8388,7 +8388,7 @@
                 <w:sz w:val="24"/>
                 <w:szCs w:val="24"/>
               </w:rPr>
-              <w:t xml:space="preserve">يطبّق ركائز QMF-10 الخمس على منتج مالي محدد ليختبر تحقيقه لمقاصد المال (10.3)</w:t>
+              <w:t xml:space="preserve">يطبّق ركائز QMF-10 الخمس على منتج مالي محدد، ليختبر مدى تحقيقه لمقاصد المال (10.3)</w:t>
             </w:r>
           </w:p>
         </w:tc>
@@ -9090,7 +9090,7 @@
                 <w:sz w:val="24"/>
                 <w:szCs w:val="24"/>
               </w:rPr>
-              <w:t xml:space="preserve">يشرح الفرق بين الحلال والطيب والخير في الاستثمار بالمنظور القرآني (11.2–11.3)</w:t>
+              <w:t xml:space="preserve">يشرح الفروق بين الحلال والطيب والخير في الاستثمار من المنظور القرآني (11.2–11.3)</w:t>
             </w:r>
           </w:p>
         </w:tc>
@@ -11057,7 +11057,7 @@
                 <w:sz w:val="24"/>
                 <w:szCs w:val="24"/>
               </w:rPr>
-              <w:t xml:space="preserve">يقيّم الأدوار الاستراتيجية للمهارات الثماني في سياق المقارنة بين القطاعات</w:t>
+              <w:t xml:space="preserve">يقيّم الأدوار الاستراتيجية للمهارات الثماني حين يقارن بين القطاعات</w:t>
             </w:r>
           </w:p>
         </w:tc>
@@ -11704,7 +11704,7 @@
                 <w:sz w:val="24"/>
                 <w:szCs w:val="24"/>
               </w:rPr>
-              <w:t xml:space="preserve">يصف العلاقة بين اليقيني القرآني والبيان النبوي مصدرين متكاملين لبناء نظرية إدارية (14.6)</w:t>
+              <w:t xml:space="preserve">يصف العلاقة بين اليقيني القرآني والبيان النبوي بوصفهما مصدرين متكاملين لبناء نظرية إدارية (14.6)</w:t>
             </w:r>
           </w:p>
         </w:tc>

</xml_diff>